<commit_message>
Penyesuaian BAB 1 dan BAB 2
</commit_message>
<xml_diff>
--- a/Proposal Muhammad As Shaff/Proposal PA Muhammad As Shaff .docx
+++ b/Proposal Muhammad As Shaff/Proposal PA Muhammad As Shaff .docx
@@ -12360,16 +12360,6 @@
     <w:p>
       <w:pPr>
         <w:pStyle w:val="H2"/>
-      </w:pPr>
-    </w:p>
-    <w:p>
-      <w:pPr>
-        <w:pStyle w:val="H2"/>
-      </w:pPr>
-    </w:p>
-    <w:p>
-      <w:pPr>
-        <w:pStyle w:val="H2"/>
         <w:numPr>
           <w:ilvl w:val="1"/>
           <w:numId w:val="2"/>
@@ -12379,6 +12369,7 @@
       <w:bookmarkStart w:id="7" w:name="_Toc196078040"/>
       <w:proofErr w:type="spellStart"/>
       <w:r>
+        <w:lastRenderedPageBreak/>
         <w:t>Sistem</w:t>
       </w:r>
       <w:proofErr w:type="spellEnd"/>

</xml_diff>